<commit_message>
docs: fill in the author block from the preliminary-results document
Replaces the [Titulacao] and [e-mail do orientador] placeholders with the
degrees, institutions and advisor e-mail recorded in the preliminary-results
document, laid out as the template prescribes ("Titulacao. Instituicao.
E-mail"). That document still carried the literal [Titulacao] label ahead
of the real values, and marked the advisor as corresponding author as well;
neither was carried over. The superscript author markers are preserved and
the lines stay in 9 pt, as the manual requires for author addresses.

Co-Authored-By: Claude Opus 5 <noreply@anthropic.com>
</commit_message>
<xml_diff>
--- a/docs/monography/TCC - Artur Rios da Silva Oliveira.docx
+++ b/docs/monography/TCC - Artur Rios da Silva Oliveira.docx
@@ -136,7 +136,7 @@
           <w:color w:val="000000"/>
           <w:sz w:val="18"/>
         </w:rPr>
-        <w:t xml:space="preserve"> [Titulação]. E-mail autor correspondente: arturdev@duck.com</w:t>
+        <w:t xml:space="preserve"> Bacharel em Sistemas de Informação. UMC. E-mail autor correspondente: arturdev@duck.com</w:t>
       </w:r>
     </w:p>
     <w:p>
@@ -164,7 +164,7 @@
           <w:color w:val="000000"/>
           <w:sz w:val="18"/>
         </w:rPr>
-        <w:t xml:space="preserve"> [Titulação]. E-mail: [e-mail do orientador]</w:t>
+        <w:t xml:space="preserve"> Mestre em Administração. USP. E-mail: mouco@alumni.usp.br</w:t>
       </w:r>
     </w:p>
     <w:p>

</xml_diff>